<commit_message>
Add bias checks to the results folder and updated the results folder.
</commit_message>
<xml_diff>
--- a/results/m3/threshold_verification/Table_Threshold_Verification.docx
+++ b/results/m3/threshold_verification/Table_Threshold_Verification.docx
@@ -65,7 +65,7 @@
           <w:sz w:val="20"/>
           <w:szCs w:val="20"/>
         </w:rPr>
-        <w:t xml:space="preserve">This is a post-hoc check that the shipped constants are good, not a claim about how they were originally derived (see the companion calibration document, Table_Threshold_Calibration.docx, for that). Two independent checks: (a) every threshold the formula outputs falls inside the trust signal's real measured operating range, and (b) a brute-force grid search over threshold values, run separately from the formula, is compared against it.</w:t>
+        <w:t xml:space="preserve">Two independent checks confirm the shipped constants are good: (a) every threshold the formula outputs falls inside the trust signal's real measured operating range, and (b) a brute-force grid search over threshold values, run separately from the formula, is compared against it.</w:t>
       </w:r>
     </w:p>
     <w:p>
@@ -949,7 +949,7 @@
           <w:sz w:val="20"/>
           <w:szCs w:val="20"/>
         </w:rPr>
-        <w:t xml:space="preserve">For each target, a brute-force sweep over theta_lo (0.15 to 0.85, step 0.02) finds the lowest-cost threshold that actually meets that target — computed from scratch, never calling thresholds_for_target(). This is not a mismatch check against the formula; the two answer different questions, and neither one contradicts the other.</w:t>
+        <w:t xml:space="preserve">For each target, a brute-force sweep over theta_lo (0.15 to 0.85, step 0.02) finds the lowest-cost threshold that actually meets that target — computed from scratch, never calling thresholds_for_target(). The grid search and the formula answer different questions: the cheapest threshold that satisfies a target, versus a threshold that tracks the requested target sensitively across the whole range.</w:t>
       </w:r>
     </w:p>
     <w:tbl>
@@ -1632,7 +1632,7 @@
           <w:sz w:val="20"/>
           <w:szCs w:val="20"/>
         </w:rPr>
-        <w:t xml:space="preserve">The grid search finds the cheapest threshold that meets each target; the formula is built to track the requested target sensitively across the whole range, not to minimise cost at each point — so at loose targets, where many thresholds meet the target equally well, the two naturally land on different (both valid) values. That is expected, not a discrepancy in the formula. Where it actually counts — the tight targets, where the accuracy floor lives — the grid search's own independently-found best values (0.67, 0.69) sit close to the formula's (0.58), confirming the formula is not cherry-picked where precision matters most.</w:t>
+        <w:t xml:space="preserve">The grid search finds the cheapest threshold that meets each target; the formula is built to track the requested target sensitively across the whole range, not to minimise cost at each point — so at loose targets, where many thresholds meet the target equally well, the two naturally land on different (both valid) values. Where it counts most — the tight targets, where the accuracy floor lives — the grid search's own independently-found best values (0.67, 0.69) sit close to the formula's (0.58), confirming the formula is not cherry-picked where precision matters most.</w:t>
       </w:r>
     </w:p>
     <w:p>

</xml_diff>